<commit_message>
Auto commit (2026-10-07 16:47) — 3 changes
Claude Code 세션 종료 시 자동 커밋.

Co-Authored-By: Claude <noreply@anthropic.com>
Claude-Session: https://claude.ai/code/5591c702-1858-4360-9925-22aed83d50e2
</commit_message>
<xml_diff>
--- a/projects/38_revenge_puck/My Ex's Rival Is My Christmas Boyfriend_작품개요.docx
+++ b/projects/38_revenge_puck/My Ex's Rival Is My Christmas Boyfriend_작품개요.docx
@@ -224,7 +224,7 @@
           <w:b w:val="0"/>
           <w:sz w:val="20"/>
         </w:rPr>
-        <w:t>• 원작에서 바뀐 것 ① 원작의 플레이오프 결승 → 크리스마스이브 결승. 가짜 연애 기한도 크리스마스이브 결승이 끝나는 날(크리스마스카드에 적은 셋째 규칙).</w:t>
+        <w:t>• 원작에서 바뀐 것 ① 원작의 플레이오프 결승 → 크리스마스이브 결승. 가짜 연애 기한도 크리스마스이브 결승이 끝나는 날(크리스마스카드에 적은 셋째 규칙). 몰리는 체이스에게 흔들리는 게 겁나 21화에서 그 기한을 크리스마스 자선 갈라 밤으로 앞당긴다.</w:t>
       </w:r>
     </w:p>
     <w:p>
@@ -264,6 +264,19 @@
           <w:sz w:val="20"/>
         </w:rPr>
         <w:t>• 원작에서 바뀐 것 ④ 원작 무료 15화를 9화로 압축했고, 인물 이름은 전부 새로 지었다.</w:t>
+      </w:r>
+    </w:p>
+    <w:p>
+      <w:pPr>
+        <w:spacing w:after="80"/>
+      </w:pPr>
+      <w:r>
+        <w:rPr>
+          <w:rFonts w:ascii="Malgun Gothic" w:hAnsi="Malgun Gothic" w:eastAsia="Malgun Gothic"/>
+          <w:b w:val="0"/>
+          <w:sz w:val="20"/>
+        </w:rPr>
+        <w:t>• 원작에서 바뀐 것 ⑤ 고백 방향: 원작은 여주가 처음부터 진심이었고 남주가 늦게 깨닫지만, 우리는 체이스가 오래전부터 몰리를 좋아했고 몰리가 늦게 깨닫는다. 그래서 49·50화 고백 대사의 화자가 원작과 반대다.</w:t>
       </w:r>
     </w:p>
     <w:p>
@@ -450,7 +463,7 @@
           <w:b w:val="0"/>
           <w:sz w:val="20"/>
         </w:rPr>
-        <w:t xml:space="preserve"> — 몰리의 언니. 몰리에게 크리스마스 과자 바구니를 보내고, 몰리가 체이스와 헤어진 밤 몰리를 안아 준다.</w:t>
+        <w:t xml:space="preserve"> — 몰리의 언니. 몰리에게 크리스마스 과자 바구니를 보내고, 몰리가 체이스와 헤어진 날 몰리를 안아 준다.</w:t>
       </w:r>
     </w:p>
     <w:p>
@@ -554,7 +567,7 @@
           <w:b w:val="0"/>
           <w:sz w:val="20"/>
         </w:rPr>
-        <w:t>② 원작 광고 소재로 잘 된 장면(트리트먼트 15~19화 · 34~36화)은 장면·대사·수위를 빼거나 약하게 하지 말 것.</w:t>
+        <w:t>② 원작 광고 소재로 잘 된 장면(트리트먼트 13화 · 15~19화 · 34~36화)은 장면·대사·수위를 빼거나 약하게 하지 말 것.</w:t>
       </w:r>
     </w:p>
     <w:sectPr>

</xml_diff>